<commit_message>
Agregados recursos visuales, animaciones de explosion, menu y niveles
</commit_message>
<xml_diff>
--- a/HELICOPTERO/Informe_Investigacion.docx
+++ b/HELICOPTERO/Informe_Investigacion.docx
@@ -345,7 +345,31 @@
           <w:sz w:val="22"/>
           <w:lang w:val="es-419"/>
         </w:rPr>
-        <w:t xml:space="preserve">u misión es volar sin </w:t>
+        <w:t>u misión es</w:t>
+      </w:r>
+      <w:r>
+        <w:rPr>
+          <w:rFonts w:ascii="Times New Roman" w:hAnsi="Times New Roman" w:cs="Times New Roman"/>
+          <w:sz w:val="22"/>
+          <w:lang w:val="es-419"/>
+        </w:rPr>
+        <w:t xml:space="preserve"> salvar a los sobrevivientes y </w:t>
+      </w:r>
+      <w:r>
+        <w:rPr>
+          <w:rFonts w:ascii="Times New Roman" w:hAnsi="Times New Roman" w:cs="Times New Roman"/>
+          <w:sz w:val="22"/>
+          <w:lang w:val="es-419"/>
+        </w:rPr>
+        <w:t>también</w:t>
+      </w:r>
+      <w:r>
+        <w:rPr>
+          <w:rFonts w:ascii="Times New Roman" w:hAnsi="Times New Roman" w:cs="Times New Roman"/>
+          <w:sz w:val="22"/>
+          <w:lang w:val="es-419"/>
+        </w:rPr>
+        <w:t xml:space="preserve"> volar sin </w:t>
       </w:r>
       <w:r>
         <w:rPr>
@@ -368,23 +392,6 @@
       <w:pPr>
         <w:rPr>
           <w:rFonts w:ascii="Times New Roman" w:hAnsi="Times New Roman" w:cs="Times New Roman"/>
-          <w:sz w:val="22"/>
-          <w:lang w:val="es-419"/>
-        </w:rPr>
-      </w:pPr>
-      <w:r>
-        <w:rPr>
-          <w:rFonts w:ascii="Times New Roman" w:hAnsi="Times New Roman" w:cs="Times New Roman"/>
-          <w:sz w:val="22"/>
-          <w:lang w:val="es-419"/>
-        </w:rPr>
-        <w:t>El juego está hecho con un programa llamado Qt, que es como una caja de herramientas para hacer programas con dibujos, botones y ventanas.</w:t>
-      </w:r>
-    </w:p>
-    <w:p>
-      <w:pPr>
-        <w:rPr>
-          <w:rFonts w:ascii="Times New Roman" w:hAnsi="Times New Roman" w:cs="Times New Roman"/>
           <w:b/>
           <w:sz w:val="22"/>
           <w:lang w:val="es-419"/>
@@ -522,7 +529,7 @@
           <w:rFonts w:ascii="Times New Roman" w:hAnsi="Times New Roman" w:cs="Times New Roman"/>
           <w:lang w:val="es-419"/>
         </w:rPr>
-        <w:t>2.1 Qt Widgets: los ladrillos de las ventanas</w:t>
+        <w:t xml:space="preserve">2.1 Qt Widgets: </w:t>
       </w:r>
     </w:p>
     <w:p>
@@ -722,7 +729,7 @@
           <w:lang w:val="es-419"/>
         </w:rPr>
         <w:lastRenderedPageBreak/>
-        <w:t>2.5 QPixmap: el álbum de fotos</w:t>
+        <w:t xml:space="preserve">2.5 QPixmap: </w:t>
       </w:r>
     </w:p>
     <w:p>
@@ -755,7 +762,7 @@
           <w:rFonts w:ascii="Times New Roman" w:hAnsi="Times New Roman" w:cs="Times New Roman"/>
           <w:lang w:val="es-419"/>
         </w:rPr>
-        <w:t>2.6 QTimer: el reloj despertador</w:t>
+        <w:t>2.6 QTimer:</w:t>
       </w:r>
     </w:p>
     <w:p>
@@ -788,7 +795,7 @@
           <w:rFonts w:ascii="Times New Roman" w:hAnsi="Times New Roman" w:cs="Times New Roman"/>
           <w:lang w:val="es-419"/>
         </w:rPr>
-        <w:t>2.7 QMediaPlayer y QAudioOutput: el radio</w:t>
+        <w:t xml:space="preserve">2.7 QMediaPlayer y QAudioOutput: </w:t>
       </w:r>
     </w:p>
     <w:p>
@@ -889,7 +896,7 @@
           <w:sz w:val="22"/>
           <w:lang w:val="es-419"/>
         </w:rPr>
-        <w:t>, detecta choques entre ellos y funciona en Windows, Mac y Linux. Es como comprar una casa ya construida en vez de hacerla desde cero.</w:t>
+        <w:t>, detecta choques entre ellos y funciona en Windows, Mac y Linux.</w:t>
       </w:r>
     </w:p>
     <w:p>
@@ -937,7 +944,24 @@
           <w:rFonts w:ascii="Times New Roman" w:hAnsi="Times New Roman" w:cs="Times New Roman"/>
           <w:sz w:val="22"/>
         </w:rPr>
-        <w:t>- Qt Graphics View Framework: https://doc.qt.io/qt-6/graphicsview.html</w:t>
+        <w:t xml:space="preserve">- Qt Graphics View Framework: </w:t>
+      </w:r>
+      <w:hyperlink r:id="rId4" w:history="1">
+        <w:r>
+          <w:rPr>
+            <w:rStyle w:val="Hyperlink"/>
+            <w:rFonts w:ascii="Times New Roman" w:hAnsi="Times New Roman" w:cs="Times New Roman"/>
+            <w:sz w:val="22"/>
+          </w:rPr>
+          <w:t>https://doc.qt.io/qt-6/graphicsview.html</w:t>
+        </w:r>
+      </w:hyperlink>
+      <w:r>
+        <w:rPr>
+          <w:rFonts w:ascii="Times New Roman" w:hAnsi="Times New Roman" w:cs="Times New Roman"/>
+          <w:sz w:val="22"/>
+        </w:rPr>
+        <w:t xml:space="preserve"> </w:t>
       </w:r>
     </w:p>
     <w:p>
@@ -969,7 +993,54 @@
           <w:sz w:val="22"/>
           <w:lang w:val="es-419"/>
         </w:rPr>
-        <w:t>- Qt QTimer: https://doc.qt.io/qt-6/qtimer.html</w:t>
+        <w:t xml:space="preserve">- Qt QTimer: </w:t>
+      </w:r>
+      <w:hyperlink r:id="rId5" w:history="1">
+        <w:r>
+          <w:rPr>
+            <w:rStyle w:val="Hyperlink"/>
+            <w:rFonts w:ascii="Times New Roman" w:hAnsi="Times New Roman" w:cs="Times New Roman"/>
+            <w:sz w:val="22"/>
+            <w:lang w:val="es-419"/>
+          </w:rPr>
+          <w:t>https://doc.qt.io/qt-6/qtimer.html</w:t>
+        </w:r>
+      </w:hyperlink>
+    </w:p>
+    <w:p>
+      <w:pPr>
+        <w:rPr>
+          <w:rFonts w:ascii="Times New Roman" w:hAnsi="Times New Roman" w:cs="Times New Roman"/>
+          <w:sz w:val="22"/>
+          <w:lang w:val="es-419"/>
+        </w:rPr>
+      </w:pPr>
+      <w:r>
+        <w:rPr>
+          <w:rFonts w:ascii="Times New Roman" w:hAnsi="Times New Roman" w:cs="Times New Roman"/>
+          <w:sz w:val="22"/>
+          <w:lang w:val="es-419"/>
+        </w:rPr>
+        <w:t xml:space="preserve">- </w:t>
+      </w:r>
+      <w:hyperlink r:id="rId6" w:history="1">
+        <w:r>
+          <w:rPr>
+            <w:rStyle w:val="Hyperlink"/>
+            <w:rFonts w:ascii="Times New Roman" w:hAnsi="Times New Roman" w:cs="Times New Roman"/>
+            <w:sz w:val="22"/>
+            <w:lang w:val="es-419"/>
+          </w:rPr>
+          <w:t>https://youtu.be/9lqhMLFHj3A?si=EKyArzR_e47CW23V</w:t>
+        </w:r>
+      </w:hyperlink>
+      <w:r>
+        <w:rPr>
+          <w:rFonts w:ascii="Times New Roman" w:hAnsi="Times New Roman" w:cs="Times New Roman"/>
+          <w:sz w:val="22"/>
+          <w:lang w:val="es-419"/>
+        </w:rPr>
+        <w:t xml:space="preserve"> // Video tutoriales</w:t>
       </w:r>
     </w:p>
     <w:p>
@@ -1010,7 +1081,7 @@
                     <pic:cNvPicPr/>
                   </pic:nvPicPr>
                   <pic:blipFill>
-                    <a:blip r:embed="rId4" cstate="print">
+                    <a:blip r:embed="rId7" cstate="print">
                       <a:extLst>
                         <a:ext uri="{28A0092B-C50C-407E-A947-70E740481C1C}">
                           <a14:useLocalDpi xmlns:a14="http://schemas.microsoft.com/office/drawing/2010/main" val="0"/>
@@ -1962,6 +2033,29 @@
       <w:spacing w:val="5"/>
     </w:rPr>
   </w:style>
+  <w:style w:type="character" w:styleId="Hyperlink">
+    <w:name w:val="Hyperlink"/>
+    <w:basedOn w:val="DefaultParagraphFont"/>
+    <w:uiPriority w:val="99"/>
+    <w:unhideWhenUsed/>
+    <w:rsid w:val="00CB24EC"/>
+    <w:rPr>
+      <w:color w:val="467886" w:themeColor="hyperlink"/>
+      <w:u w:val="single"/>
+    </w:rPr>
+  </w:style>
+  <w:style w:type="character" w:styleId="UnresolvedMention">
+    <w:name w:val="Unresolved Mention"/>
+    <w:basedOn w:val="DefaultParagraphFont"/>
+    <w:uiPriority w:val="99"/>
+    <w:semiHidden/>
+    <w:unhideWhenUsed/>
+    <w:rsid w:val="00CB24EC"/>
+    <w:rPr>
+      <w:color w:val="605E5C"/>
+      <w:shd w:val="clear" w:color="auto" w:fill="E1DFDD"/>
+    </w:rPr>
+  </w:style>
 </w:styles>
 </file>
 

</xml_diff>